<commit_message>
Performed practical 9 and 10 of FSD
</commit_message>
<xml_diff>
--- a/23CS056_Practical4.docx
+++ b/23CS056_Practical4.docx
@@ -473,6 +473,32 @@
               </w:rPr>
               <w:t xml:space="preserve"> </w:t>
             </w:r>
+            <w:hyperlink r:id="rId6" w:history="1">
+              <w:r>
+                <w:rPr>
+                  <w:rStyle w:val="Hyperlink"/>
+                  <w:b/>
+                  <w:bCs/>
+                </w:rPr>
+                <w:t>https://github.com/Yash-109/FSD/tr</w:t>
+              </w:r>
+              <w:r>
+                <w:rPr>
+                  <w:rStyle w:val="Hyperlink"/>
+                  <w:b/>
+                  <w:bCs/>
+                </w:rPr>
+                <w:t>e</w:t>
+              </w:r>
+              <w:r>
+                <w:rPr>
+                  <w:rStyle w:val="Hyperlink"/>
+                  <w:b/>
+                  <w:bCs/>
+                </w:rPr>
+                <w:t>e/main/practical-4</w:t>
+              </w:r>
+            </w:hyperlink>
           </w:p>
         </w:tc>
       </w:tr>
@@ -541,9 +567,9 @@
               <mc:AlternateContent>
                 <mc:Choice Requires="wps">
                   <w:drawing>
-                    <wp:inline distT="0" distB="0" distL="0" distR="0" wp14:anchorId="482BD925" wp14:editId="553641B3">
+                    <wp:inline distT="0" distB="0" distL="0" distR="0" wp14:anchorId="482BD925" wp14:editId="73104565">
                       <wp:extent cx="6052184" cy="3271522"/>
-                      <wp:effectExtent l="0" t="0" r="5716" b="5078"/>
+                      <wp:effectExtent l="0" t="0" r="5715" b="15240"/>
                       <wp:docPr id="356158580" name="Frame1"/>
                       <wp:cNvGraphicFramePr/>
                       <a:graphic xmlns:a="http://schemas.openxmlformats.org/drawingml/2006/main">
@@ -576,10 +602,10 @@
                                       <w:noProof/>
                                     </w:rPr>
                                     <w:drawing>
-                                      <wp:inline distT="0" distB="0" distL="0" distR="0" wp14:anchorId="7CA97ABD" wp14:editId="18824D87">
-                                        <wp:extent cx="6122035" cy="2983230"/>
-                                        <wp:effectExtent l="0" t="0" r="0" b="7620"/>
-                                        <wp:docPr id="128094116" name="Picture 3"/>
+                                      <wp:inline distT="0" distB="0" distL="0" distR="0" wp14:anchorId="76BE744E" wp14:editId="71ACAAB8">
+                                        <wp:extent cx="6122035" cy="5283200"/>
+                                        <wp:effectExtent l="0" t="0" r="0" b="0"/>
+                                        <wp:docPr id="63045859" name="Picture 3"/>
                                         <wp:cNvGraphicFramePr>
                                           <a:graphicFrameLocks xmlns:a="http://schemas.openxmlformats.org/drawingml/2006/main" noChangeAspect="1"/>
                                         </wp:cNvGraphicFramePr>
@@ -593,7 +619,7 @@
                                                 </pic:cNvPicPr>
                                               </pic:nvPicPr>
                                               <pic:blipFill>
-                                                <a:blip r:embed="rId6">
+                                                <a:blip r:embed="rId7">
                                                   <a:extLst>
                                                     <a:ext uri="{28A0092B-C50C-407E-A947-70E740481C1C}">
                                                       <a14:useLocalDpi xmlns:a14="http://schemas.microsoft.com/office/drawing/2010/main" val="0"/>
@@ -608,7 +634,7 @@
                                               <pic:spPr bwMode="auto">
                                                 <a:xfrm>
                                                   <a:off x="0" y="0"/>
-                                                  <a:ext cx="6122035" cy="2983230"/>
+                                                  <a:ext cx="6122035" cy="5283200"/>
                                                 </a:xfrm>
                                                 <a:prstGeom prst="rect">
                                                   <a:avLst/>
@@ -625,7 +651,13 @@
                                     </w:drawing>
                                   </w:r>
                                   <w:r>
-                                    <w:t>Figure 1: Task - 4</w:t>
+                                    <w:t xml:space="preserve">Figure 1: Task </w:t>
+                                  </w:r>
+                                  <w:r>
+                                    <w:t>–</w:t>
+                                  </w:r>
+                                  <w:r>
+                                    <w:t xml:space="preserve"> 4</w:t>
                                   </w:r>
                                 </w:p>
                               </w:txbxContent>
@@ -658,10 +690,10 @@
                                 <w:noProof/>
                               </w:rPr>
                               <w:drawing>
-                                <wp:inline distT="0" distB="0" distL="0" distR="0" wp14:anchorId="7CA97ABD" wp14:editId="18824D87">
-                                  <wp:extent cx="6122035" cy="2983230"/>
-                                  <wp:effectExtent l="0" t="0" r="0" b="7620"/>
-                                  <wp:docPr id="128094116" name="Picture 3"/>
+                                <wp:inline distT="0" distB="0" distL="0" distR="0" wp14:anchorId="76BE744E" wp14:editId="71ACAAB8">
+                                  <wp:extent cx="6122035" cy="5283200"/>
+                                  <wp:effectExtent l="0" t="0" r="0" b="0"/>
+                                  <wp:docPr id="63045859" name="Picture 3"/>
                                   <wp:cNvGraphicFramePr>
                                     <a:graphicFrameLocks xmlns:a="http://schemas.openxmlformats.org/drawingml/2006/main" noChangeAspect="1"/>
                                   </wp:cNvGraphicFramePr>
@@ -675,7 +707,7 @@
                                           </pic:cNvPicPr>
                                         </pic:nvPicPr>
                                         <pic:blipFill>
-                                          <a:blip r:embed="rId6">
+                                          <a:blip r:embed="rId7">
                                             <a:extLst>
                                               <a:ext uri="{28A0092B-C50C-407E-A947-70E740481C1C}">
                                                 <a14:useLocalDpi xmlns:a14="http://schemas.microsoft.com/office/drawing/2010/main" val="0"/>
@@ -690,7 +722,7 @@
                                         <pic:spPr bwMode="auto">
                                           <a:xfrm>
                                             <a:off x="0" y="0"/>
-                                            <a:ext cx="6122035" cy="2983230"/>
+                                            <a:ext cx="6122035" cy="5283200"/>
                                           </a:xfrm>
                                           <a:prstGeom prst="rect">
                                             <a:avLst/>
@@ -707,7 +739,13 @@
                               </w:drawing>
                             </w:r>
                             <w:r>
-                              <w:t>Figure 1: Task - 4</w:t>
+                              <w:t xml:space="preserve">Figure 1: Task </w:t>
+                            </w:r>
+                            <w:r>
+                              <w:t>–</w:t>
+                            </w:r>
+                            <w:r>
+                              <w:t xml:space="preserve"> 4</w:t>
                             </w:r>
                           </w:p>
                         </w:txbxContent>
@@ -730,15 +768,14 @@
             </w:pPr>
             <w:r>
               <w:rPr>
-                <w:b/>
-                <w:bCs/>
+                <w:noProof/>
               </w:rPr>
               <w:lastRenderedPageBreak/>
               <w:drawing>
-                <wp:inline distT="0" distB="0" distL="0" distR="0" wp14:anchorId="72CF09E1" wp14:editId="0BBAF587">
-                  <wp:extent cx="6052185" cy="3078480"/>
-                  <wp:effectExtent l="0" t="0" r="5715" b="7620"/>
-                  <wp:docPr id="1479578694" name="Picture 1"/>
+                <wp:inline distT="0" distB="0" distL="0" distR="0" wp14:anchorId="6B45D39A" wp14:editId="70E56FC2">
+                  <wp:extent cx="6052185" cy="5580380"/>
+                  <wp:effectExtent l="0" t="0" r="5715" b="1270"/>
+                  <wp:docPr id="1501163800" name="Picture 4"/>
                   <wp:cNvGraphicFramePr>
                     <a:graphicFrameLocks xmlns:a="http://schemas.openxmlformats.org/drawingml/2006/main" noChangeAspect="1"/>
                   </wp:cNvGraphicFramePr>
@@ -746,23 +783,36 @@
                     <a:graphicData uri="http://schemas.openxmlformats.org/drawingml/2006/picture">
                       <pic:pic xmlns:pic="http://schemas.openxmlformats.org/drawingml/2006/picture">
                         <pic:nvPicPr>
-                          <pic:cNvPr id="1479578694" name=""/>
-                          <pic:cNvPicPr/>
+                          <pic:cNvPr id="0" name="Picture 3"/>
+                          <pic:cNvPicPr>
+                            <a:picLocks noChangeAspect="1" noChangeArrowheads="1"/>
+                          </pic:cNvPicPr>
                         </pic:nvPicPr>
                         <pic:blipFill>
-                          <a:blip r:embed="rId7"/>
+                          <a:blip r:embed="rId8">
+                            <a:extLst>
+                              <a:ext uri="{28A0092B-C50C-407E-A947-70E740481C1C}">
+                                <a14:useLocalDpi xmlns:a14="http://schemas.microsoft.com/office/drawing/2010/main" val="0"/>
+                              </a:ext>
+                            </a:extLst>
+                          </a:blip>
+                          <a:srcRect/>
                           <a:stretch>
                             <a:fillRect/>
                           </a:stretch>
                         </pic:blipFill>
-                        <pic:spPr>
+                        <pic:spPr bwMode="auto">
                           <a:xfrm>
                             <a:off x="0" y="0"/>
-                            <a:ext cx="6052185" cy="3078480"/>
+                            <a:ext cx="6052185" cy="5580380"/>
                           </a:xfrm>
                           <a:prstGeom prst="rect">
                             <a:avLst/>
                           </a:prstGeom>
+                          <a:noFill/>
+                          <a:ln>
+                            <a:noFill/>
+                          </a:ln>
                         </pic:spPr>
                       </pic:pic>
                     </a:graphicData>
@@ -862,8 +912,8 @@
       </w:pPr>
     </w:p>
     <w:sectPr>
-      <w:headerReference w:type="default" r:id="rId8"/>
-      <w:footerReference w:type="default" r:id="rId9"/>
+      <w:headerReference w:type="default" r:id="rId9"/>
+      <w:footerReference w:type="default" r:id="rId10"/>
       <w:pgSz w:w="11909" w:h="16834"/>
       <w:pgMar w:top="1134" w:right="1134" w:bottom="1134" w:left="1134" w:header="720" w:footer="720" w:gutter="0"/>
       <w:cols w:space="720"/>
@@ -1385,7 +1435,6 @@
   <w:style w:type="character" w:default="1" w:styleId="DefaultParagraphFont">
     <w:name w:val="Default Paragraph Font"/>
     <w:uiPriority w:val="1"/>
-    <w:semiHidden/>
     <w:unhideWhenUsed/>
   </w:style>
   <w:style w:type="table" w:default="1" w:styleId="TableNormal">
@@ -1529,6 +1578,18 @@
     <w:rPr>
       <w:color w:val="605E5C"/>
       <w:shd w:val="clear" w:color="auto" w:fill="E1DFDD"/>
+    </w:rPr>
+  </w:style>
+  <w:style w:type="character" w:styleId="FollowedHyperlink">
+    <w:name w:val="FollowedHyperlink"/>
+    <w:basedOn w:val="DefaultParagraphFont"/>
+    <w:uiPriority w:val="99"/>
+    <w:semiHidden/>
+    <w:unhideWhenUsed/>
+    <w:rsid w:val="00C219CE"/>
+    <w:rPr>
+      <w:color w:val="954F72" w:themeColor="followedHyperlink"/>
+      <w:u w:val="single"/>
     </w:rPr>
   </w:style>
 </w:styles>

</xml_diff>